<commit_message>
Updated Resume: website details
</commit_message>
<xml_diff>
--- a/Resume/Lorenzo Miguel Bo - Resume.docx
+++ b/Resume/Lorenzo Miguel Bo - Resume.docx
@@ -101,7 +101,23 @@
                 <w:sz w:val="16"/>
                 <w:szCs w:val="16"/>
               </w:rPr>
-              <w:t xml:space="preserve">lmbdata.github.io </w:t>
+              <w:t>l</w:t>
+            </w:r>
+            <w:r>
+              <w:rPr>
+                <w:color w:val="585858"/>
+                <w:sz w:val="16"/>
+                <w:szCs w:val="16"/>
+              </w:rPr>
+              <w:t>orenzomiguelbo</w:t>
+            </w:r>
+            <w:r>
+              <w:rPr>
+                <w:color w:val="585858"/>
+                <w:sz w:val="16"/>
+                <w:szCs w:val="16"/>
+              </w:rPr>
+              <w:t xml:space="preserve">.github.io </w:t>
             </w:r>
             <w:r>
               <w:rPr>
@@ -2094,7 +2110,25 @@
                 <w:sz w:val="20"/>
                 <w:szCs w:val="20"/>
               </w:rPr>
-              <w:t>lmbdata.github.io</w:t>
+              <w:t>l</w:t>
+            </w:r>
+            <w:r>
+              <w:rPr>
+                <w:b/>
+                <w:color w:val="585858"/>
+                <w:sz w:val="20"/>
+                <w:szCs w:val="20"/>
+              </w:rPr>
+              <w:t>orenzomiguelbo</w:t>
+            </w:r>
+            <w:r>
+              <w:rPr>
+                <w:b/>
+                <w:color w:val="585858"/>
+                <w:sz w:val="20"/>
+                <w:szCs w:val="20"/>
+              </w:rPr>
+              <w:t>.github.io</w:t>
             </w:r>
           </w:p>
           <w:p>

</xml_diff>